<commit_message>
Refactor DTO mapper layers
</commit_message>
<xml_diff>
--- a/Bouffard_Noah_MS02.docx
+++ b/Bouffard_Noah_MS02.docx
@@ -871,7 +871,7 @@
     </w:p>
     <w:p>
       <w:r>
-        <w:t>The requestModel and responseModel DTOs used by the aggregator are implemented in auction-service/src/main/java/com/ryannoah/auction/presentationlayer/AuctionController.java.</w:t>
+        <w:t>The requestModel and responseModel DTOs used by the aggregator are implemented in auction-service/src/main/java/com/ryannoah/auction/presentationlayer/dto, with conversion handled by auction-service/src/main/java/com/ryannoah/auction/datamappinglayer.</w:t>
       </w:r>
     </w:p>
     <w:tbl>
@@ -937,7 +937,7 @@
           </w:tcPr>
           <w:p>
             <w:r>
-              <w:t>CreateAuctionRequest</w:t>
+              <w:t>CreateAuctionRequestDTO</w:t>
             </w:r>
           </w:p>
         </w:tc>
@@ -1025,7 +1025,7 @@
           </w:tcPr>
           <w:p>
             <w:r>
-              <w:t>AuctionResponse</w:t>
+              <w:t>AuctionResponseDTO</w:t>
             </w:r>
           </w:p>
         </w:tc>

</xml_diff>

<commit_message>
Update milestone Word doc
</commit_message>
<xml_diff>
--- a/Bouffard_Noah_MS02.docx
+++ b/Bouffard_Noah_MS02.docx
@@ -218,7 +218,7 @@
     </w:p>
     <w:p>
       <w:r>
-        <w:t>The Auction Service is the aggregator/orchestrator. It owns the Auction aggregate, persists auction and bid data in MongoDB, and orchestrates listing, user, and invoice use cases through its domain client layer. The API Gateway exposes all low-level microservice endpoints and aggregator endpoints with HATEOAS-style links.</w:t>
+        <w:t>The Auction Service is the aggregator/orchestrator. It owns the Auction aggregate, persists auction and bid data in MongoDB, and orchestrates listing, user, and invoice use cases through its domain client layer. The API Gateway exposes all low-level microservice endpoints and aggregator endpoints with HATEOAS-style links. The final cleanup also simplified the controller code by moving request/response objects into DTO packages and moving conversion logic into mapper classes.</w:t>
       </w:r>
     </w:p>
     <w:p>
@@ -557,7 +557,7 @@
     </w:p>
     <w:p>
       <w:r>
-        <w:t>The implementation follows the updated DDD and C4 diagrams through one Gradle multi-project build and five deployable services. The package layers use the teacher-style structure: presentationlayer, businesslogiclayer, dataccesslayer, domain, utilities, and domainclientlayer where HTTP clients are required.</w:t>
+        <w:t>The implementation follows the updated DDD and C4 diagrams through one Gradle multi-project build and five deployable services. The package layers use the teacher-style structure: presentationlayer, presentationlayer/dto, businesslogiclayer, datamappinglayer, dataccesslayer, domain, utilities, and domainclientlayer where HTTP clients are required. Controllers stay simple by returning ResponseEntity objects and delegating DTO conversion to mapper classes.</w:t>
       </w:r>
     </w:p>
     <w:tbl>
@@ -871,7 +871,7 @@
     </w:p>
     <w:p>
       <w:r>
-        <w:t>The requestModel and responseModel DTOs used by the aggregator are implemented in auction-service/src/main/java/com/ryannoah/auction/presentationlayer/dto, with conversion handled by auction-service/src/main/java/com/ryannoah/auction/datamappinglayer.</w:t>
+        <w:t>The requestModel and responseModel DTOs used by the aggregator are implemented in auction-service/src/main/java/com/ryannoah/auction/presentationlayer/dto, with conversion handled by auction-service/src/main/java/com/ryannoah/auction/datamappinglayer. The low-level services follow the same DTO and mapper structure, so request/response models are kept out of controllers and domain objects are not exposed directly.</w:t>
       </w:r>
     </w:p>
     <w:tbl>
@@ -959,7 +959,7 @@
           </w:tcPr>
           <w:p>
             <w:r>
-              <w:t>UpdateAuctionRequest</w:t>
+              <w:t>UpdateAuctionRequestDTO</w:t>
             </w:r>
           </w:p>
         </w:tc>
@@ -981,7 +981,7 @@
           </w:tcPr>
           <w:p>
             <w:r>
-              <w:t>PlaceBidRequest</w:t>
+              <w:t>PlaceBidRequestDTO</w:t>
             </w:r>
           </w:p>
         </w:tc>
@@ -1003,7 +1003,7 @@
           </w:tcPr>
           <w:p>
             <w:r>
-              <w:t>UpdateBidRequest</w:t>
+              <w:t>UpdateBidRequestDTO</w:t>
             </w:r>
           </w:p>
         </w:tc>
@@ -1047,7 +1047,7 @@
           </w:tcPr>
           <w:p>
             <w:r>
-              <w:t>BidResponse</w:t>
+              <w:t>BidResponseDTO</w:t>
             </w:r>
           </w:p>
         </w:tc>
@@ -2006,7 +2006,7 @@
     </w:p>
     <w:p>
       <w:r>
-        <w:t>The project was verified with ./gradlew clean build. The Gradle build passed and generated test logs and JaCoCo reports for all five services.</w:t>
+        <w:t>The project was verified with ./gradlew clean build test. The Gradle build passed and generated test logs and JaCoCo reports for all five services.</w:t>
       </w:r>
     </w:p>
     <w:p>

</xml_diff>